<commit_message>
Improve development tutorial and final presentation materials
</commit_message>
<xml_diff>
--- a/presentation/FastAPI_Complete_Presentation_Script_1-17.docx
+++ b/presentation/FastAPI_Complete_Presentation_Script_1-17.docx
@@ -619,7 +619,7 @@
         <w:pStyle w:val="Heading2"/>
       </w:pPr>
       <w:r>
-        <w:t>第12页：现场演示（重点，约2分30秒）</w:t>
+        <w:t>第12页：现场演示（重点，目标2分15秒）</w:t>
       </w:r>
     </w:p>
     <w:p>
@@ -814,7 +814,7 @@
         <w:pStyle w:val="Heading2"/>
       </w:pPr>
       <w:r>
-        <w:t>第13页  Eight Tests Verify the Main API Behaviour  ·  约45–55秒</w:t>
+        <w:t>第13页  Eight Tests Verify the Main API Behaviour  ·  约40秒</w:t>
       </w:r>
     </w:p>
     <w:p>
@@ -825,7 +825,7 @@
           <w:color w:val="68747E"/>
           <w:sz w:val="18"/>
         </w:rPr>
-        <w:t>【操作】接过话，先看左上标题。不要再切回Swagger UI。</w:t>
+        <w:t>【操作】第13页用约40秒：切到已打开的第二个 PowerShell 窗口，运行测试，再返回PPT。</w:t>
       </w:r>
     </w:p>
     <w:p>
@@ -837,7 +837,7 @@
     <w:p>
       <w:pPr/>
       <w:r>
-        <w:t>Each test uses a fresh in-memory repository. Eight passing results confirm that the main routes work as expected.</w:t>
+        <w:t>We use pytest and TestClient. Each test starts with an empty repository.</w:t>
       </w:r>
     </w:p>
     <w:p>
@@ -848,31 +848,13 @@
           <w:color w:val="68747E"/>
           <w:sz w:val="18"/>
         </w:rPr>
-        <w:t>【操作】按右侧DOCS → CRUD → FILTERS → ERRORS的真实顺序朗读。</w:t>
+        <w:t>【操作】简要说明底部 DOCS → CRUD → FILTERS → ERRORS 四类测试。</w:t>
       </w:r>
     </w:p>
     <w:p>
       <w:pPr/>
       <w:r>
-        <w:t>First, Docs: /docs and OpenAPI schema.</w:t>
-      </w:r>
-    </w:p>
-    <w:p>
-      <w:pPr/>
-      <w:r>
-        <w:t>Second, CRUD: Create, read, replace and delete.</w:t>
-      </w:r>
-    </w:p>
-    <w:p>
-      <w:pPr/>
-      <w:r>
-        <w:t>Third, Filters: Status and priority queries.</w:t>
-      </w:r>
-    </w:p>
-    <w:p>
-      <w:pPr/>
-      <w:r>
-        <w:t>Finally, Errors: 404 and 422 responses.</w:t>
+        <w:t>The tests cover documentation, CRUD, filters and error responses.</w:t>
       </w:r>
     </w:p>
     <w:p>
@@ -883,7 +865,7 @@
           <w:color w:val="68747E"/>
           <w:sz w:val="18"/>
         </w:rPr>
-        <w:t>【操作】指向黑色pytest截图绿色的“8 passed”。</w:t>
+        <w:t>【操作】在 fastapi-project 目录运行：..\.venv\Scripts\python.exe -m pytest -q。指向终端里的 8 passed。</w:t>
       </w:r>
     </w:p>
     <w:p>
@@ -900,13 +882,13 @@
           <w:color w:val="68747E"/>
           <w:sz w:val="18"/>
         </w:rPr>
-        <w:t>【操作】最后读底部原句。</w:t>
+        <w:t>【操作】回到第13页，说明 TestClient 不需要启动 Uvicorn。</w:t>
       </w:r>
     </w:p>
     <w:p>
       <w:pPr/>
       <w:r>
-        <w:t>TestClient sends normal HTTP-style requests without starting Uvicorn. A fresh repository keeps each test independent.</w:t>
+        <w:t>TestClient does not need a running server.</w:t>
       </w:r>
     </w:p>
     <w:p>
@@ -917,7 +899,7 @@
           <w:color w:val="68747E"/>
           <w:sz w:val="18"/>
         </w:rPr>
-        <w:t>【操作】截图同时有1 warning，不需要主动解释；如被问，回答：It is a deprecation warning. All eight tests passed.</w:t>
+        <w:t>【操作】测试耗时每次会不同。若终端故障，直接说明PPT中的测试总结，继续第14页。</w:t>
       </w:r>
     </w:p>
     <w:p>
@@ -1136,7 +1118,7 @@
           <w:color w:val="68747E"/>
           <w:sz w:val="18"/>
         </w:rPr>
-        <w:t>【操作】第13页：指着8 passed测试截图，按 DOCS→CRUD→FILTERS→ERRORS 顺序读。</w:t>
+        <w:t>【操作】第13页：运行准备好的 pytest 命令，说明 8 passed，再回PPT简要解释四类测试。</w:t>
       </w:r>
     </w:p>
     <w:p>
@@ -1147,7 +1129,7 @@
           <w:color w:val="68747E"/>
           <w:sz w:val="18"/>
         </w:rPr>
-        <w:t>【操作】第18页参考文献、第19–20页备用问答：正常演讲不需要讲。</w:t>
+        <w:t>【操作】第18页为参考文献。正式讲解第1–17页，参考文献无需逐条朗读。</w:t>
       </w:r>
     </w:p>
     <w:p>

</xml_diff>